<commit_message>
docs: sanitize shared files and split bugfix and UI tasks
</commit_message>
<xml_diff>
--- a/docs/INSTALL_PLUGIN_WINDOWS.docx
+++ b/docs/INSTALL_PLUGIN_WINDOWS.docx
@@ -75,7 +75,7 @@
             <w:color w:val="25577A"/>
             <w:u w:val="single"/>
           </w:rPr>
-          <w:t>Открыть репозиторий Aintrex mosprom2026</w:t>
+          <w:t>Откройте GitHub и перейдите по ссылке от команды</w:t>
         </w:r>
       </w:hyperlink>
     </w:p>
@@ -221,7 +221,7 @@
           <w:rFonts w:ascii="Consolas" w:hAnsi="Consolas"/>
           <w:sz w:val="19"/>
         </w:rPr>
-        <w:t>git clone -b main https://github.com/Aintrex/mosprom2026.git "$env:USERPROFILE\STE-AI"</w:t>
+        <w:t>git clone -b main (Read-Host 'URL Git') "$env:USERPROFILE\STE-AI"</w:t>
       </w:r>
     </w:p>
     <w:p>

</xml_diff>